<commit_message>
Version soutenance v1 : nettoyage, scripts de demo, graphiques et rapport
</commit_message>
<xml_diff>
--- a/client/rapport_visionai.docx
+++ b/client/rapport_visionai.docx
@@ -223,7 +223,7 @@
         <w:jc w:val="both"/>
       </w:pPr>
       <w:r>
-        <w:t xml:space="preserve">Le projet est aujourd'hui fonctionnel de bout en bout. Le cœur ML implémente quatre familles de modèles (linéaire, perceptron multi-couches, réseau RBF et SVM), trois optimiseurs, une suite complète de métriques et la sérialisation des modèles ; l'ensemble est validé par 123 tests automatisés. Les modèles sont exposés en Python et via une API REST, et une application cliente web permet de les exploiter sur de nouvelles données. Cette chaîne complète est démontrée sur les cas de test classiques ainsi que sur un jeu de données d'images constitué pour le projet.</w:t>
+        <w:t xml:space="preserve">Le projet est aujourd'hui fonctionnel de bout en bout. Le cœur ML implémente les quatre modèles demandés par le cahier des charges (modèle linéaire, perceptron multi-couches, réseau RBF et SVM), tous écrits à la main, ainsi que la sauvegarde et le chargement des modèles ; l'ensemble est validé par plus de 90 tests automatisés. Les modèles sont exposés en Python et via une API REST, et une application cliente web permet de les exploiter sur de nouvelles données. Cette chaîne complète est démontrée sur les cas de test classiques ainsi que sur un jeu de données d'images constitué pour le projet.</w:t>
       </w:r>
     </w:p>
     <w:p>
@@ -239,7 +239,7 @@
         <w:t xml:space="preserve">Répartition de l'équipe. </w:t>
       </w:r>
       <w:r>
-        <w:t xml:space="preserve">Valentin a pris en charge le cœur ML (les mathématiques, le MLP, la rétropropagation, les optimiseurs, les métriques et les tests). Thinina a réalisé l'API serveur, les bindings Python, la construction du jeu de données ainsi que le modèle linéaire et le type Vector. Ali assure la partie données et expérimentation en Python (prétraitement, notebooks d'analyse). La répartition détaillée figure en annexe.</w:t>
+        <w:t xml:space="preserve">Valentin a pris en charge le cœur ML (les mathématiques, le MLP, la rétropropagation et les tests). Thinina a réalisé l'API serveur, les bindings Python, la construction du jeu de données ainsi que le modèle linéaire et le type Vector. Ali assure la partie données et expérimentation en Python (prétraitement, notebooks d'analyse). La répartition détaillée figure en annexe.</w:t>
       </w:r>
     </w:p>
     <w:p>
@@ -256,7 +256,7 @@
         <w:jc w:val="both"/>
       </w:pPr>
       <w:r>
-        <w:t xml:space="preserve">Le cahier des charges demande de concevoir une bibliothèque de Machine Learning dans un langage système (C, C++ ou Rust), assortie de plusieurs interfaces d'utilisation. Les livrables attendus sont les suivants :</w:t>
+        <w:t xml:space="preserve">Le cahier des charges demande de concevoir une bibliothèque de Machine Learning dans un langage système (C, C++ ou Rust), utilisable comme bibliothèque depuis des scripts Python, et d'appliquer les modèles à une problématique applicative réelle. Les modèles imposés sont : le modèle linéaire, le perceptron multi-couches, le réseau RBF et le SVM (ou une proposition équivalente). Les livrables attendus sont les suivants :</w:t>
       </w:r>
     </w:p>
     <w:p>
@@ -269,7 +269,7 @@
         <w:spacing w:after="60" w:line="276"/>
       </w:pPr>
       <w:r>
-        <w:t xml:space="preserve">un cœur ML en Rust comprenant les outils mathématiques de base et plusieurs types de modèles (linéaire, réseau de neurones, RBF, SVM) ;</w:t>
+        <w:t xml:space="preserve">un cœur ML en Rust comprenant les outils mathématiques de base et les quatre modèles imposés, implémentés sans bibliothèque externe ;</w:t>
       </w:r>
     </w:p>
     <w:p>
@@ -282,7 +282,7 @@
         <w:spacing w:after="60" w:line="276"/>
       </w:pPr>
       <w:r>
-        <w:t xml:space="preserve">la démonstration de l'ensemble des algorithmes et modèles sur les cas de test ainsi que sur un jeu de données constitué ;</w:t>
+        <w:t xml:space="preserve">la démonstration de la justesse des implémentations sur les cas de test classiques, puis leur application au jeu de données constitué ;</w:t>
       </w:r>
     </w:p>
     <w:p>
@@ -321,7 +321,7 @@
         <w:spacing w:after="60" w:line="276"/>
       </w:pPr>
       <w:r>
-        <w:t xml:space="preserve">une application cliente offrant un test visuel de la chaîne complète ;</w:t>
+        <w:t xml:space="preserve">une application cliente reliée à l'API, et la mise en évidence par des courbes des phénomènes d'apprentissage (sur-apprentissage, sous-apprentissage, impact des paramètres) ;</w:t>
       </w:r>
     </w:p>
     <w:p>
@@ -334,7 +334,7 @@
         <w:spacing w:after="60" w:line="276"/>
       </w:pPr>
       <w:r>
-        <w:t xml:space="preserve">des tests démontrant que les modèles apprennent correctement, un projet de démonstration accompagné de ses sources, et un rapport.</w:t>
+        <w:t xml:space="preserve">un projet de démonstration avec ses sources, un document Jupyter interactif et un rapport.</w:t>
       </w:r>
     </w:p>
     <w:p>
@@ -596,7 +596,7 @@
                 <w:sz w:val="20"/>
                 <w:szCs w:val="20"/>
               </w:rPr>
-              <w:t xml:space="preserve">Optimiseurs</w:t>
+              <w:t xml:space="preserve">Entraînement</w:t>
             </w:r>
           </w:p>
         </w:tc>
@@ -656,7 +656,7 @@
                 <w:sz w:val="20"/>
                 <w:szCs w:val="20"/>
               </w:rPr>
-              <w:t xml:space="preserve">Descente de gradient, SGD momentum (+ Nesterov), Adam</w:t>
+              <w:t xml:space="preserve">Descente de gradient ; moindres carrés pour le RBF ; SMO pour le SVM à noyau</w:t>
             </w:r>
           </w:p>
         </w:tc>
@@ -691,7 +691,7 @@
                 <w:sz w:val="20"/>
                 <w:szCs w:val="20"/>
               </w:rPr>
-              <w:t xml:space="preserve">Métriques d'évaluation</w:t>
+              <w:t xml:space="preserve">Sauvegarde / chargement</w:t>
             </w:r>
           </w:p>
         </w:tc>
@@ -751,7 +751,7 @@
                 <w:sz w:val="20"/>
                 <w:szCs w:val="20"/>
               </w:rPr>
-              <w:t xml:space="preserve">Accuracy, confusion, précision/rappel/F1, MSE/MAE/R², k-fold</w:t>
+              <w:t xml:space="preserve">Format JSON, pour les quatre modèles</w:t>
             </w:r>
           </w:p>
         </w:tc>
@@ -786,7 +786,7 @@
                 <w:sz w:val="20"/>
                 <w:szCs w:val="20"/>
               </w:rPr>
-              <w:t xml:space="preserve">Sérialisation des modèles</w:t>
+              <w:t xml:space="preserve">Tests (plus de 90)</w:t>
             </w:r>
           </w:p>
         </w:tc>
@@ -846,102 +846,7 @@
                 <w:sz w:val="20"/>
                 <w:szCs w:val="20"/>
               </w:rPr>
-              <w:t xml:space="preserve">JSON et binaire, pour les quatre modèles</w:t>
-            </w:r>
-          </w:p>
-        </w:tc>
-      </w:tr>
-      <w:tr>
-        <w:trPr>
-          <w:tblHeader w:val="false"/>
-        </w:trPr>
-        <w:tc>
-          <w:tcPr>
-            <w:tcW w:type="dxa" w:w="3600"/>
-            <w:tcBorders>
-              <w:top w:val="single" w:color="BBBBBB" w:sz="1"/>
-              <w:left w:val="single" w:color="BBBBBB" w:sz="1"/>
-              <w:bottom w:val="single" w:color="BBBBBB" w:sz="1"/>
-              <w:right w:val="single" w:color="BBBBBB" w:sz="1"/>
-            </w:tcBorders>
-            <w:shd w:fill="FFFFFF" w:val="clear"/>
-            <w:tcMar>
-              <w:top w:type="dxa" w:w="60"/>
-              <w:left w:type="dxa" w:w="110"/>
-              <w:bottom w:type="dxa" w:w="60"/>
-              <w:right w:type="dxa" w:w="110"/>
-            </w:tcMar>
-          </w:tcPr>
-          <w:p>
-            <w:r>
-              <w:rPr>
-                <w:b w:val="false"/>
-                <w:bCs w:val="false"/>
-                <w:color w:val="000000"/>
-                <w:sz w:val="20"/>
-                <w:szCs w:val="20"/>
-              </w:rPr>
-              <w:t xml:space="preserve">Tests (123 au total)</w:t>
-            </w:r>
-          </w:p>
-        </w:tc>
-        <w:tc>
-          <w:tcPr>
-            <w:tcW w:type="dxa" w:w="1500"/>
-            <w:tcBorders>
-              <w:top w:val="single" w:color="BBBBBB" w:sz="1"/>
-              <w:left w:val="single" w:color="BBBBBB" w:sz="1"/>
-              <w:bottom w:val="single" w:color="BBBBBB" w:sz="1"/>
-              <w:right w:val="single" w:color="BBBBBB" w:sz="1"/>
-            </w:tcBorders>
-            <w:shd w:fill="FFFFFF" w:val="clear"/>
-            <w:tcMar>
-              <w:top w:type="dxa" w:w="60"/>
-              <w:left w:type="dxa" w:w="110"/>
-              <w:bottom w:type="dxa" w:w="60"/>
-              <w:right w:type="dxa" w:w="110"/>
-            </w:tcMar>
-          </w:tcPr>
-          <w:p>
-            <w:r>
-              <w:rPr>
-                <w:b w:val="false"/>
-                <w:bCs w:val="false"/>
-                <w:color w:val="000000"/>
-                <w:sz w:val="20"/>
-                <w:szCs w:val="20"/>
-              </w:rPr>
-              <w:t xml:space="preserve">Réalisé</w:t>
-            </w:r>
-          </w:p>
-        </w:tc>
-        <w:tc>
-          <w:tcPr>
-            <w:tcW w:type="dxa" w:w="4260"/>
-            <w:tcBorders>
-              <w:top w:val="single" w:color="BBBBBB" w:sz="1"/>
-              <w:left w:val="single" w:color="BBBBBB" w:sz="1"/>
-              <w:bottom w:val="single" w:color="BBBBBB" w:sz="1"/>
-              <w:right w:val="single" w:color="BBBBBB" w:sz="1"/>
-            </w:tcBorders>
-            <w:shd w:fill="FFFFFF" w:val="clear"/>
-            <w:tcMar>
-              <w:top w:type="dxa" w:w="60"/>
-              <w:left w:type="dxa" w:w="110"/>
-              <w:bottom w:type="dxa" w:w="60"/>
-              <w:right w:type="dxa" w:w="110"/>
-            </w:tcMar>
-          </w:tcPr>
-          <w:p>
-            <w:r>
-              <w:rPr>
-                <w:b w:val="false"/>
-                <w:bCs w:val="false"/>
-                <w:color w:val="000000"/>
-                <w:sz w:val="20"/>
-                <w:szCs w:val="20"/>
-              </w:rPr>
-              <w:t xml:space="preserve">54 unitaires et 69 d'intégration</w:t>
+              <w:t xml:space="preserve">38 unitaires et 53 d'intégration</w:t>
             </w:r>
           </w:p>
         </w:tc>
@@ -1718,7 +1623,7 @@
                 <w:sz w:val="20"/>
                 <w:szCs w:val="20"/>
               </w:rPr>
-              <w:t xml:space="preserve">Cœur : mathématiques, modèles, optimiseurs, métriques</w:t>
+              <w:t xml:space="preserve">Cœur : mathématiques et modèles ML</w:t>
             </w:r>
           </w:p>
         </w:tc>
@@ -1748,7 +1653,7 @@
                 <w:sz w:val="20"/>
                 <w:szCs w:val="20"/>
               </w:rPr>
-              <w:t xml:space="preserve">Vector, Matrix, activations ; Linéaire, MLP, RBF, SVM ; gradient/momentum/Adam ; métriques ; sérialisation</w:t>
+              <w:t xml:space="preserve">Vector, Matrix, activations ; Linéaire, MLP, RBF, SVM ; descente de gradient ; sérialisation JSON</w:t>
             </w:r>
           </w:p>
         </w:tc>
@@ -2398,16 +2303,16 @@
         <w:pStyle w:val="Heading2"/>
       </w:pPr>
       <w:r>
-        <w:t xml:space="preserve">11.2. L'astuce du noyau et les noyaux disponibles</w:t>
-      </w:r>
-    </w:p>
-    <w:p>
-      <w:pPr>
-        <w:spacing w:after="120" w:line="276"/>
-        <w:jc w:val="both"/>
-      </w:pPr>
-      <w:r>
-        <w:t xml:space="preserve">Pour les données non séparables linéairement, nous recourons à l'astuce du noyau (kernel trick) : au lieu de transformer explicitement les données dans un espace de dimension supérieure, le SVM calcule directement des produits scalaires dans cet espace au moyen d'une fonction noyau. Trois noyaux ont été implémentés : linéaire (a·b), RBF ou gaussien (exp(−γ·||a−b||²)) et polynomial ((a·b + coef0) élevé au degré). Le SVM à noyau est entraîné par une version simplifiée de l'algorithme SMO (Sequential Minimal Optimization), qui optimise les multiplicateurs de Lagrange α deux par deux, sous les contraintes 0 ≤ αᵢ ≤ C et Σ αᵢyᵢ = 0. Seuls les exemples associés à un α non nul — les « vecteurs de support » — sont conservés pour la prédiction.</w:t>
+        <w:t xml:space="preserve">11.2. L'astuce du noyau</w:t>
+      </w:r>
+    </w:p>
+    <w:p>
+      <w:pPr>
+        <w:spacing w:after="120" w:line="276"/>
+        <w:jc w:val="both"/>
+      </w:pPr>
+      <w:r>
+        <w:t xml:space="preserve">Pour les données non séparables linéairement, nous recourons à l'astuce du noyau (kernel trick) : au lieu de transformer explicitement les données dans un espace de dimension supérieure, le SVM calcule directement des produits scalaires dans cet espace au moyen d'une fonction noyau. Deux noyaux ont été implémentés : le noyau linéaire (a·b) et le noyau RBF, ou gaussien (exp(−γ·||a−b||²)). Le SVM à noyau est entraîné par une version simplifiée de l'algorithme SMO (Sequential Minimal Optimization), qui optimise les multiplicateurs de Lagrange α deux par deux, sous les contraintes 0 ≤ αᵢ ≤ C et Σ αᵢyᵢ = 0. Seuls les exemples associés à un α non nul — les « vecteurs de support » — sont conservés pour la prédiction.</w:t>
       </w:r>
     </w:p>
     <w:p>
@@ -2432,16 +2337,68 @@
         <w:pStyle w:val="Heading1"/>
       </w:pPr>
       <w:r>
-        <w:t xml:space="preserve">12. Les optimiseurs</w:t>
-      </w:r>
-    </w:p>
-    <w:p>
-      <w:pPr>
-        <w:spacing w:after="120" w:line="276"/>
-        <w:jc w:val="both"/>
-      </w:pPr>
-      <w:r>
-        <w:t xml:space="preserve">La descente de gradient élémentaire est fonctionnelle, mais sa convergence est lente et sujette à des oscillations. Nous avons donc implémenté des optimiseurs plus évolués, réunis derrière un trait commun Optimizer : chaque paramètre est identifié par un index stable, et l'optimiseur met à jour sa valeur à partir de son gradient. Cette abstraction permet de changer d'optimiseur sans modifier le code des modèles.</w:t>
+        <w:t xml:space="preserve">12. L'évaluation des modèles</w:t>
+      </w:r>
+    </w:p>
+    <w:p>
+      <w:pPr>
+        <w:spacing w:after="120" w:line="276"/>
+        <w:jc w:val="both"/>
+      </w:pPr>
+      <w:r>
+        <w:t xml:space="preserve">Le cahier des charges demande une étude des performances des modèles et la mise en évidence, par des courbes, des phénomènes d'apprentissage : sous-apprentissage, sur-apprentissage, biais éventuel du jeu de données, et difficulté de trouver un modèle à la fois assez complexe pour apprendre et assez simple pour généraliser.</w:t>
+      </w:r>
+    </w:p>
+    <w:p>
+      <w:pPr>
+        <w:spacing w:after="120" w:line="276"/>
+        <w:jc w:val="both"/>
+      </w:pPr>
+      <w:r>
+        <w:t xml:space="preserve">Cette évaluation est réalisée dans les notebooks Python, qui pilotent les modèles via les bindings. Les courbes (évolution de la perte et de l'exactitude au fil des époques) sont produites avec Matplotlib, comme le recommande le cahier des charges. L'exactitude (accuracy) et la matrice de confusion sont calculées avec scikit-learn. Cet usage de scikit-learn est limité à l'évaluation des résultats : les modèles eux-mêmes restent entièrement implémentés à la main en Rust, conformément à l'interdiction d'utiliser des implémentations externes des algorithmes. Les bindings exposent en complément une méthode accuracy directement sur les modèles, pratique pour un contrôle rapide depuis Python.</w:t>
+      </w:r>
+    </w:p>
+    <w:p>
+      <w:pPr>
+        <w:pStyle w:val="Heading1"/>
+      </w:pPr>
+      <w:r>
+        <w:t xml:space="preserve">13. La sauvegarde des modèles</w:t>
+      </w:r>
+    </w:p>
+    <w:p>
+      <w:pPr>
+        <w:spacing w:after="120" w:line="276"/>
+        <w:jc w:val="both"/>
+      </w:pPr>
+      <w:r>
+        <w:t xml:space="preserve">La sérialisation consiste à convertir un modèle en mémoire, avec l'ensemble de ses poids, en un fichier sauvegardable et rechargeable ultérieurement, ce qui évite tout réentraînement et permet de servir un modèle pré-entraîné depuis le serveur. Nous avons utilisé serde, la bibliothèque de référence en Rust : l'ajout de l'attribut #[derive(Serialize, Deserialize)] sur les structures suffit à générer le code de conversion. Les quatre modèles (Linéaire, MLP, RBF, SVM) prennent en charge la sauvegarde au format JSON.</w:t>
+      </w:r>
+    </w:p>
+    <w:p>
+      <w:pPr>
+        <w:spacing w:after="120" w:line="276"/>
+        <w:jc w:val="both"/>
+      </w:pPr>
+      <w:r>
+        <w:t xml:space="preserve">Le format JSON est un texte lisible faisant apparaître les poids, les biais et les tailles de couches, ce qui facilite la vérification et le débogage d'un modèle. Des tests vérifient qu'une sauvegarde suivie d'un rechargement restitue exactement les mêmes prédictions (à 1e-10 près), point d'autant plus important que les nombres à virgule flottante peuvent occasionner des pertes de précision.</w:t>
+      </w:r>
+    </w:p>
+    <w:p>
+      <w:pPr>
+        <w:pStyle w:val="Heading1"/>
+      </w:pPr>
+      <w:r>
+        <w:t xml:space="preserve">14. L'API REST : le système client/serveur</w:t>
+      </w:r>
+    </w:p>
+    <w:p>
+      <w:pPr>
+        <w:spacing w:after="120" w:line="276"/>
+        <w:jc w:val="both"/>
+      </w:pPr>
+      <w:r>
+        <w:t xml:space="preserve">Une API REST est un serveur web répondant à des requêtes HTTP. Dans notre cas, le serveur reçoit une image et renvoie la prédiction du modèle. Ce fonctionnement correspond à celui des services de ML en production : le modèle s'exécute sur un serveur, et les clients (site web, application mobile) lui adressent des requêtes. Nous avons utilisé Axum, un framework web Rust asynchrone capable de traiter plusieurs requêtes en parallèle. Cette partie a été réalisée par Thinina.</w:t>
       </w:r>
     </w:p>
     <w:p>
@@ -2449,201 +2406,7 @@
         <w:pStyle w:val="Heading2"/>
       </w:pPr>
       <w:r>
-        <w:t xml:space="preserve">12.1. La descente de gradient</w:t>
-      </w:r>
-    </w:p>
-    <w:p>
-      <w:pPr>
-        <w:spacing w:after="120" w:line="276"/>
-        <w:jc w:val="both"/>
-      </w:pPr>
-      <w:r>
-        <w:t xml:space="preserve">Dans sa version de base, chaque poids est déplacé d'un pas proportionnel au gradient (poids ← poids − lr · gradient). Simple et fiable, cette méthode demeure sensible au choix du taux d'apprentissage.</w:t>
-      </w:r>
-    </w:p>
-    <w:p>
-      <w:pPr>
-        <w:pStyle w:val="Heading2"/>
-      </w:pPr>
-      <w:r>
-        <w:t xml:space="preserve">12.2. Le SGD avec momentum (et Nesterov)</w:t>
-      </w:r>
-    </w:p>
-    <w:p>
-      <w:pPr>
-        <w:spacing w:after="120" w:line="276"/>
-        <w:jc w:val="both"/>
-      </w:pPr>
-      <w:r>
-        <w:t xml:space="preserve">Le momentum introduit une forme d'inertie : une vitesse v = momentum·v − lr·gradient est accumulée, et le poids est déplacé de cette vitesse. Le modèle conserve ainsi une partie de sa dynamique, ce qui accélère la convergence et atténue les oscillations dans les vallées étroites de la fonction de coût. La variante de Nesterov évalue le gradient légèrement en avant, en anticipant le pas de momentum, ce qui améliore généralement la précision de la convergence.</w:t>
-      </w:r>
-    </w:p>
-    <w:p>
-      <w:pPr>
-        <w:pStyle w:val="Heading2"/>
-      </w:pPr>
-      <w:r>
-        <w:t xml:space="preserve">12.3. Adam</w:t>
-      </w:r>
-    </w:p>
-    <w:p>
-      <w:pPr>
-        <w:spacing w:after="120" w:line="276"/>
-        <w:jc w:val="both"/>
-      </w:pPr>
-      <w:r>
-        <w:t xml:space="preserve">Adam (Adaptive Moment Estimation) combine deux mécanismes : il maintient une moyenne mobile du gradient (moment d'ordre 1, comparable au momentum) et une moyenne mobile du carré du gradient (moment d'ordre 2), assorties d'une correction de biais en début d'entraînement. Chaque paramètre dispose ainsi d'un taux d'apprentissage adaptatif : les paramètres au gradient instable progressent prudemment, les autres plus rapidement. En pratique, Adam offre la convergence la plus régulière et nécessite le moindre réglage du taux d'apprentissage, ce que nous avons vérifié sur le XOR.</w:t>
-      </w:r>
-    </w:p>
-    <w:p>
-      <w:pPr>
-        <w:pStyle w:val="Heading1"/>
-      </w:pPr>
-      <w:r>
-        <w:t xml:space="preserve">13. L'évaluation : les métriques</w:t>
-      </w:r>
-    </w:p>
-    <w:p>
-      <w:pPr>
-        <w:spacing w:after="120" w:line="276"/>
-        <w:jc w:val="both"/>
-      </w:pPr>
-      <w:r>
-        <w:t xml:space="preserve">L'accuracy (proportion de prédictions correctes) ne suffit pas à apprécier la qualité d'un modèle, en particulier lorsque les classes sont déséquilibrées. Nous avons donc implémenté un module de métriques complet.</w:t>
-      </w:r>
-    </w:p>
-    <w:p>
-      <w:pPr>
-        <w:pStyle w:val="ListParagraph"/>
-        <w:numPr>
-          <w:ilvl w:val="0"/>
-          <w:numId w:val="2"/>
-        </w:numPr>
-        <w:spacing w:after="60" w:line="276"/>
-      </w:pPr>
-      <w:r>
-        <w:t xml:space="preserve">Matrice de confusion : tableau croisant les classes réelles et les classes prédites, qui met en évidence les confusions entre classes.</w:t>
-      </w:r>
-    </w:p>
-    <w:p>
-      <w:pPr>
-        <w:pStyle w:val="ListParagraph"/>
-        <w:numPr>
-          <w:ilvl w:val="0"/>
-          <w:numId w:val="2"/>
-        </w:numPr>
-        <w:spacing w:after="60" w:line="276"/>
-      </w:pPr>
-      <w:r>
-        <w:t xml:space="preserve">Précision, rappel et F1 par classe : la précision indique, lorsque le modèle prédit une classe, la fréquence à laquelle il a raison ; le rappel indique la proportion d'exemples d'une classe effectivement retrouvés ; le F1 est leur moyenne harmonique. Le F1 macro (moyenne sur les classes) est également calculé.</w:t>
-      </w:r>
-    </w:p>
-    <w:p>
-      <w:pPr>
-        <w:pStyle w:val="ListParagraph"/>
-        <w:numPr>
-          <w:ilvl w:val="0"/>
-          <w:numId w:val="2"/>
-        </w:numPr>
-        <w:spacing w:after="60" w:line="276"/>
-      </w:pPr>
-      <w:r>
-        <w:t xml:space="preserve">MSE, MAE et R² : destinées aux tâches de régression, la MSE et la MAE mesurent l'erreur moyenne (au carré ou en valeur absolue), tandis que le R² évalue la part de variance expliquée (1 correspond à un ajustement parfait, 0 à une prédiction équivalente à la moyenne, une valeur négative à un résultat inférieur à la moyenne).</w:t>
-      </w:r>
-    </w:p>
-    <w:p>
-      <w:pPr>
-        <w:pStyle w:val="ListParagraph"/>
-        <w:numPr>
-          <w:ilvl w:val="0"/>
-          <w:numId w:val="2"/>
-        </w:numPr>
-        <w:spacing w:after="60" w:line="276"/>
-      </w:pPr>
-      <w:r>
-        <w:t xml:space="preserve">Validation croisée k-fold : pour une évaluation robuste, les données sont découpées en k parties ; le modèle est entraîné sur k−1 d'entre elles et testé sur la dernière, l'opération étant répétée. L'estimation obtenue est plus fiable que celle issue d'un découpage unique.</w:t>
-      </w:r>
-    </w:p>
-    <w:p>
-      <w:pPr>
-        <w:spacing w:after="80"/>
-      </w:pPr>
-    </w:p>
-    <w:p>
-      <w:pPr>
-        <w:spacing w:after="120" w:line="276"/>
-        <w:jc w:val="both"/>
-      </w:pPr>
-      <w:r>
-        <w:t xml:space="preserve">Disposer de ces métriques au sein même de la bibliothèque, et non uniquement via scikit-learn côté Python, nous a contraints à comprendre précisément la signification de chacune, plutôt que de nous en remettre à une valeur dont l'origine resterait opaque.</w:t>
-      </w:r>
-    </w:p>
-    <w:p>
-      <w:pPr>
-        <w:pStyle w:val="Heading1"/>
-      </w:pPr>
-      <w:r>
-        <w:t xml:space="preserve">14. La sérialisation des modèles</w:t>
-      </w:r>
-    </w:p>
-    <w:p>
-      <w:pPr>
-        <w:spacing w:after="120" w:line="276"/>
-        <w:jc w:val="both"/>
-      </w:pPr>
-      <w:r>
-        <w:t xml:space="preserve">La sérialisation consiste à convertir un modèle en mémoire, avec l'ensemble de ses poids, en un fichier sauvegardable et rechargeable ultérieurement, ce qui évite tout réentraînement. Nous avons utilisé serde, la bibliothèque de référence en Rust : l'ajout de l'attribut #[derive(Serialize, Deserialize)] sur les structures suffit à générer le code de conversion. Les quatre modèles (Linéaire, MLP, RBF, SVM) prennent en charge la sauvegarde.</w:t>
-      </w:r>
-    </w:p>
-    <w:p>
-      <w:pPr>
-        <w:pStyle w:val="Heading2"/>
-      </w:pPr>
-      <w:r>
-        <w:t xml:space="preserve">14.1. Formats JSON et binaire</w:t>
-      </w:r>
-    </w:p>
-    <w:p>
-      <w:pPr>
-        <w:spacing w:after="120" w:line="276"/>
-        <w:jc w:val="both"/>
-      </w:pPr>
-      <w:r>
-        <w:t xml:space="preserve">Le format JSON est un texte lisible faisant apparaître les poids, les biais et les tailles de couches, ce qui facilite la vérification et le débogage d'un modèle, au prix d'une certaine verbosité. Pour les modèles plus volumineux, le format binaire (via bincode) offre une représentation nettement plus compacte et plus rapide, mais non lisible dans un éditeur de texte. En pratique, le JSON est employé pour le débogage et le binaire pour la production.</w:t>
-      </w:r>
-    </w:p>
-    <w:p>
-      <w:pPr>
-        <w:spacing w:after="120" w:line="276"/>
-        <w:jc w:val="both"/>
-      </w:pPr>
-      <w:r>
-        <w:t xml:space="preserve">Des tests vérifient qu'une sauvegarde suivie d'un rechargement restitue exactement les mêmes prédictions (à 1e-10 près), point d'autant plus important que les nombres à virgule flottante peuvent occasionner des pertes de précision.</w:t>
-      </w:r>
-    </w:p>
-    <w:p>
-      <w:pPr>
-        <w:pStyle w:val="Heading1"/>
-      </w:pPr>
-      <w:r>
-        <w:t xml:space="preserve">15. L'API REST : le système client/serveur</w:t>
-      </w:r>
-    </w:p>
-    <w:p>
-      <w:pPr>
-        <w:spacing w:after="120" w:line="276"/>
-        <w:jc w:val="both"/>
-      </w:pPr>
-      <w:r>
-        <w:t xml:space="preserve">Une API REST est un serveur web répondant à des requêtes HTTP. Dans notre cas, le serveur reçoit une image et renvoie la prédiction du modèle. Ce fonctionnement correspond à celui des services de ML en production : le modèle s'exécute sur un serveur, et les clients (site web, application mobile) lui adressent des requêtes. Nous avons utilisé Axum, un framework web Rust asynchrone capable de traiter plusieurs requêtes en parallèle. Cette partie a été réalisée par Thinina.</w:t>
-      </w:r>
-    </w:p>
-    <w:p>
-      <w:pPr>
-        <w:pStyle w:val="Heading2"/>
-      </w:pPr>
-      <w:r>
-        <w:t xml:space="preserve">15.1. Les endpoints</w:t>
+        <w:t xml:space="preserve">14.1. Les endpoints</w:t>
       </w:r>
     </w:p>
     <w:tbl>
@@ -3244,7 +3007,7 @@
         <w:pStyle w:val="Heading2"/>
       </w:pPr>
       <w:r>
-        <w:t xml:space="preserve">15.2. Sauvegarde, rechargement et réutilisation des modèles</w:t>
+        <w:t xml:space="preserve">14.2. Sauvegarde, rechargement et réutilisation des modèles</w:t>
       </w:r>
     </w:p>
     <w:p>
@@ -3270,7 +3033,7 @@
         <w:pStyle w:val="Heading1"/>
       </w:pPr>
       <w:r>
-        <w:t xml:space="preserve">16. Les bindings Python</w:t>
+        <w:t xml:space="preserve">15. Les bindings Python</w:t>
       </w:r>
     </w:p>
     <w:p>
@@ -3366,7 +3129,7 @@
         <w:pStyle w:val="Heading1"/>
       </w:pPr>
       <w:r>
-        <w:t xml:space="preserve">17. L'application cliente web</w:t>
+        <w:t xml:space="preserve">16. L'application cliente web</w:t>
       </w:r>
     </w:p>
     <w:p>
@@ -3392,16 +3155,16 @@
         <w:pStyle w:val="Heading1"/>
       </w:pPr>
       <w:r>
-        <w:t xml:space="preserve">18. Les tests</w:t>
-      </w:r>
-    </w:p>
-    <w:p>
-      <w:pPr>
-        <w:spacing w:after="120" w:line="276"/>
-        <w:jc w:val="both"/>
-      </w:pPr>
-      <w:r>
-        <w:t xml:space="preserve">Le projet comporte 123 tests : 54 tests unitaires, au plus près de chaque fonction, et 69 tests d'intégration, validant les modèles de bout en bout. Ils couvrent les mathématiques, les fonctions d'activation, les quatre modèles, les optimiseurs, les métriques et la sérialisation.</w:t>
+        <w:t xml:space="preserve">17. Les tests</w:t>
+      </w:r>
+    </w:p>
+    <w:p>
+      <w:pPr>
+        <w:spacing w:after="120" w:line="276"/>
+        <w:jc w:val="both"/>
+      </w:pPr>
+      <w:r>
+        <w:t xml:space="preserve">Le projet comporte plus de 90 tests : 38 tests unitaires, au plus près de chaque fonction, et 53 tests d'intégration, validant les modèles de bout en bout. Ils couvrent les mathématiques, les fonctions d'activation, les quatre modèles et la sauvegarde des modèles. Cette démarche répond à l'exigence du cahier des charges de démontrer la justesse des implémentations avant de les appliquer au jeu de données.</w:t>
       </w:r>
     </w:p>
     <w:p>
@@ -3409,7 +3172,7 @@
         <w:pStyle w:val="Heading2"/>
       </w:pPr>
       <w:r>
-        <w:t xml:space="preserve">18.1. Les cas de test logiques : XOR, AND, OR</w:t>
+        <w:t xml:space="preserve">17.1. Les cas de test logiques : XOR, AND, OR</w:t>
       </w:r>
     </w:p>
     <w:p>
@@ -3426,16 +3189,16 @@
         <w:pStyle w:val="Heading2"/>
       </w:pPr>
       <w:r>
-        <w:t xml:space="preserve">18.2. Les autres cas de test</w:t>
-      </w:r>
-    </w:p>
-    <w:p>
-      <w:pPr>
-        <w:spacing w:after="120" w:line="276"/>
-        <w:jc w:val="both"/>
-      </w:pPr>
-      <w:r>
-        <w:t xml:space="preserve">Sont également validés la classification multi-classes (trois groupes de points), une tâche de régression (apprentissage du signe d'un sinus), les différents noyaux du SVM (linéaire, RBF, polynomial), la convergence avec chaque optimiseur (momentum, Nesterov, Adam), l'exactitude des métriques, ainsi que des tests comparatifs faisant intervenir les quatre modèles sur un même problème (par exemple un jeu de données en cercles concentriques opposant le MLP et le réseau RBF).</w:t>
+        <w:t xml:space="preserve">17.2. Les autres cas de test</w:t>
+      </w:r>
+    </w:p>
+    <w:p>
+      <w:pPr>
+        <w:spacing w:after="120" w:line="276"/>
+        <w:jc w:val="both"/>
+      </w:pPr>
+      <w:r>
+        <w:t xml:space="preserve">Sont également validés la classification multi-classes (trois groupes de points), une tâche de régression (apprentissage du signe d'un sinus), les deux noyaux du SVM (linéaire et RBF), la sauvegarde et le rechargement des modèles, ainsi que des tests comparatifs faisant intervenir les quatre modèles sur un même problème (par exemple un jeu de données en cercles concentriques opposant le MLP et le réseau RBF).</w:t>
       </w:r>
     </w:p>
     <w:p>
@@ -3443,7 +3206,7 @@
         <w:pStyle w:val="Heading2"/>
       </w:pPr>
       <w:r>
-        <w:t xml:space="preserve">18.3. La gestion des tests non déterministes</w:t>
+        <w:t xml:space="preserve">17.3. La gestion des tests non déterministes</w:t>
       </w:r>
     </w:p>
     <w:p>
@@ -3460,7 +3223,7 @@
         <w:pStyle w:val="Heading1"/>
       </w:pPr>
       <w:r>
-        <w:t xml:space="preserve">19. Démonstration : cas de test et jeu de données</w:t>
+        <w:t xml:space="preserve">18. Démonstration : cas de test et jeu de données</w:t>
       </w:r>
     </w:p>
     <w:p>
@@ -3477,16 +3240,16 @@
         <w:pStyle w:val="Heading2"/>
       </w:pPr>
       <w:r>
-        <w:t xml:space="preserve">19.1. Sur les cas de test</w:t>
-      </w:r>
-    </w:p>
-    <w:p>
-      <w:pPr>
-        <w:spacing w:after="120" w:line="276"/>
-        <w:jc w:val="both"/>
-      </w:pPr>
-      <w:r>
-        <w:t xml:space="preserve">Les 69 tests d'intégration constituent une démonstration reproductible : ils établissent que chaque modèle apprend effectivement les problèmes de référence. Le tableau ci-dessous récapitule les configurations validées.</w:t>
+        <w:t xml:space="preserve">18.1. Sur les cas de test</w:t>
+      </w:r>
+    </w:p>
+    <w:p>
+      <w:pPr>
+        <w:spacing w:after="120" w:line="276"/>
+        <w:jc w:val="both"/>
+      </w:pPr>
+      <w:r>
+        <w:t xml:space="preserve">Les 53 tests d'intégration constituent une démonstration reproductible : ils établissent que chaque modèle apprend effectivement les problèmes de référence. Le tableau ci-dessous récapitule les configurations validées.</w:t>
       </w:r>
     </w:p>
     <w:tbl>
@@ -3631,7 +3394,7 @@
                 <w:sz w:val="20"/>
                 <w:szCs w:val="20"/>
               </w:rPr>
-              <w:t xml:space="preserve">MLP</w:t>
+              <w:t xml:space="preserve">Modèle linéaire</w:t>
             </w:r>
           </w:p>
         </w:tc>
@@ -3661,7 +3424,7 @@
                 <w:sz w:val="20"/>
                 <w:szCs w:val="20"/>
               </w:rPr>
-              <w:t xml:space="preserve">XOR, AND, OR, multi-classes, régression (sinus)</w:t>
+              <w:t xml:space="preserve">Régression (y = ax + b), classification AND</w:t>
             </w:r>
           </w:p>
         </w:tc>
@@ -3691,7 +3454,7 @@
                 <w:sz w:val="20"/>
                 <w:szCs w:val="20"/>
               </w:rPr>
-              <w:t xml:space="preserve">Convergence ; somme du softmax à 1 ; sérialisation fidèle</w:t>
+              <w:t xml:space="preserve">Convergence ; sérialisation fidèle</w:t>
             </w:r>
           </w:p>
         </w:tc>
@@ -3726,7 +3489,7 @@
                 <w:sz w:val="20"/>
                 <w:szCs w:val="20"/>
               </w:rPr>
-              <w:t xml:space="preserve">RBF</w:t>
+              <w:t xml:space="preserve">MLP</w:t>
             </w:r>
           </w:p>
         </w:tc>
@@ -3756,7 +3519,7 @@
                 <w:sz w:val="20"/>
                 <w:szCs w:val="20"/>
               </w:rPr>
-              <w:t xml:space="preserve">XOR, AND, multi-classes</w:t>
+              <w:t xml:space="preserve">XOR, AND, OR, multi-classes, régression (sinus)</w:t>
             </w:r>
           </w:p>
         </w:tc>
@@ -3786,7 +3549,7 @@
                 <w:sz w:val="20"/>
                 <w:szCs w:val="20"/>
               </w:rPr>
-              <w:t xml:space="preserve">Convergence ; dimension de sortie correcte ; sérialisation fidèle</w:t>
+              <w:t xml:space="preserve">Convergence ; somme du softmax à 1 ; sérialisation fidèle</w:t>
             </w:r>
           </w:p>
         </w:tc>
@@ -3821,7 +3584,7 @@
                 <w:sz w:val="20"/>
                 <w:szCs w:val="20"/>
               </w:rPr>
-              <w:t xml:space="preserve">SVM linéaire</w:t>
+              <w:t xml:space="preserve">RBF</w:t>
             </w:r>
           </w:p>
         </w:tc>
@@ -3851,7 +3614,7 @@
                 <w:sz w:val="20"/>
                 <w:szCs w:val="20"/>
               </w:rPr>
-              <w:t xml:space="preserve">AND, OR, multi-classes</w:t>
+              <w:t xml:space="preserve">XOR, AND, multi-classes</w:t>
             </w:r>
           </w:p>
         </w:tc>
@@ -3881,7 +3644,7 @@
                 <w:sz w:val="20"/>
                 <w:szCs w:val="20"/>
               </w:rPr>
-              <w:t xml:space="preserve">Convergence ; sortie softmax cohérente</w:t>
+              <w:t xml:space="preserve">Convergence ; dimension de sortie correcte ; sérialisation fidèle</w:t>
             </w:r>
           </w:p>
         </w:tc>
@@ -3916,7 +3679,7 @@
                 <w:sz w:val="20"/>
                 <w:szCs w:val="20"/>
               </w:rPr>
-              <w:t xml:space="preserve">SVM à noyau</w:t>
+              <w:t xml:space="preserve">SVM linéaire</w:t>
             </w:r>
           </w:p>
         </w:tc>
@@ -3946,7 +3709,7 @@
                 <w:sz w:val="20"/>
                 <w:szCs w:val="20"/>
               </w:rPr>
-              <w:t xml:space="preserve">XOR (noyau RBF), AND (noyau polynomial)</w:t>
+              <w:t xml:space="preserve">AND, OR, multi-classes</w:t>
             </w:r>
           </w:p>
         </w:tc>
@@ -3976,7 +3739,7 @@
                 <w:sz w:val="20"/>
                 <w:szCs w:val="20"/>
               </w:rPr>
-              <w:t xml:space="preserve">Convergence sur données non séparables</w:t>
+              <w:t xml:space="preserve">Convergence ; sortie softmax cohérente</w:t>
             </w:r>
           </w:p>
         </w:tc>
@@ -4011,7 +3774,7 @@
                 <w:sz w:val="20"/>
                 <w:szCs w:val="20"/>
               </w:rPr>
-              <w:t xml:space="preserve">Optimiseurs</w:t>
+              <w:t xml:space="preserve">SVM à noyau</w:t>
             </w:r>
           </w:p>
         </w:tc>
@@ -4041,7 +3804,7 @@
                 <w:sz w:val="20"/>
                 <w:szCs w:val="20"/>
               </w:rPr>
-              <w:t xml:space="preserve">XOR / AND avec momentum, Nesterov, Adam</w:t>
+              <w:t xml:space="preserve">XOR (noyau RBF gaussien)</w:t>
             </w:r>
           </w:p>
         </w:tc>
@@ -4071,7 +3834,7 @@
                 <w:sz w:val="20"/>
                 <w:szCs w:val="20"/>
               </w:rPr>
-              <w:t xml:space="preserve">Réduction de la fonction de coût ; convergence vérifiée</w:t>
+              <w:t xml:space="preserve">Convergence sur données non séparables</w:t>
             </w:r>
           </w:p>
         </w:tc>
@@ -4087,25 +3850,25 @@
         <w:pStyle w:val="Heading2"/>
       </w:pPr>
       <w:r>
-        <w:t xml:space="preserve">19.2. Sur le jeu de données constitué</w:t>
-      </w:r>
-    </w:p>
-    <w:p>
-      <w:pPr>
-        <w:spacing w:after="120" w:line="276"/>
-        <w:jc w:val="both"/>
-      </w:pPr>
-      <w:r>
-        <w:t xml:space="preserve">Un jeu de données d'images a été constitué, réparti en trois classes : « aucun », « humain » et « animal ». Les images sont redimensionnées en 64×64 pixels en couleur, soit 64×64×3 = 12 288 valeurs d'entrée par image ; un script de prétraitement assure cette conversion et produit des tableaux au format .npy. Les modèles sont entraînés sur ce jeu de données depuis Python, via les bindings, puis évalués au moyen de nos métriques, notamment la matrice de confusion.</w:t>
-      </w:r>
-    </w:p>
-    <w:p>
-      <w:pPr>
-        <w:spacing w:after="120" w:line="276"/>
-        <w:jc w:val="both"/>
-      </w:pPr>
-      <w:r>
-        <w:t xml:space="preserve">Des notebooks d'expérimentation pilotent cette démonstration : un notebook d'analyse du jeu de données (répartition des classes, aperçu des images), un notebook de comparaison des quatre modèles (Linéaire, MLP, RBF, SVM) et un notebook d'étude de l'influence des hyperparamètres (nombre de centres et valeur de gamma pour le RBF, taux d'apprentissage, etc.). La rédaction des résultats chiffrés et des courbes issus de ces notebooks constitue la dernière étape de finalisation du rendu.</w:t>
+        <w:t xml:space="preserve">18.2. Sur le jeu de données constitué</w:t>
+      </w:r>
+    </w:p>
+    <w:p>
+      <w:pPr>
+        <w:spacing w:after="120" w:line="276"/>
+        <w:jc w:val="both"/>
+      </w:pPr>
+      <w:r>
+        <w:t xml:space="preserve">Un jeu de données d'images a été constitué, réparti en trois classes : « aucun », « humain » et « animal ». Les images sont redimensionnées en 64×64 pixels en couleur, soit 64×64×3 = 12 288 valeurs d'entrée par image ; un script de prétraitement assure cette conversion et produit des tableaux au format .npy. Les modèles sont entraînés sur ce jeu de données depuis Python, via les bindings, puis évalués au moyen de l'exactitude et de la matrice de confusion.</w:t>
+      </w:r>
+    </w:p>
+    <w:p>
+      <w:pPr>
+        <w:spacing w:after="120" w:line="276"/>
+        <w:jc w:val="both"/>
+      </w:pPr>
+      <w:r>
+        <w:t xml:space="preserve">Des notebooks d'expérimentation pilotent cette démonstration : un notebook d'analyse du jeu de données (répartition des classes, aperçu des images), un notebook de comparaison des quatre modèles (Linéaire, MLP, RBF, SVM) et un notebook d'étude de l'influence des hyperparamètres (nombre de centres et valeur de gamma pour le RBF, paramètre C et noyau du SVM, taux d'apprentissage, architecture du MLP). La rédaction des résultats chiffrés et des courbes issus de ces notebooks constitue la dernière étape de finalisation du rendu.</w:t>
       </w:r>
     </w:p>
     <w:p>
@@ -4113,7 +3876,7 @@
         <w:pStyle w:val="Heading1"/>
       </w:pPr>
       <w:r>
-        <w:t xml:space="preserve">20. Difficultés rencontrées</w:t>
+        <w:t xml:space="preserve">19. Difficultés rencontrées</w:t>
       </w:r>
     </w:p>
     <w:p>
@@ -4130,7 +3893,7 @@
         <w:pStyle w:val="Heading2"/>
       </w:pPr>
       <w:r>
-        <w:t xml:space="preserve">20.1. L'apprentissage simultané de Rust et du ML</w:t>
+        <w:t xml:space="preserve">19.1. L'apprentissage simultané de Rust et du ML</w:t>
       </w:r>
     </w:p>
     <w:p>
@@ -4147,7 +3910,7 @@
         <w:pStyle w:val="Heading2"/>
       </w:pPr>
       <w:r>
-        <w:t xml:space="preserve">20.2. La rétropropagation</w:t>
+        <w:t xml:space="preserve">19.2. La rétropropagation</w:t>
       </w:r>
     </w:p>
     <w:p>
@@ -4164,7 +3927,7 @@
         <w:pStyle w:val="Heading2"/>
       </w:pPr>
       <w:r>
-        <w:t xml:space="preserve">20.3. Le borrow checker</w:t>
+        <w:t xml:space="preserve">19.3. Le borrow checker</w:t>
       </w:r>
     </w:p>
     <w:p>
@@ -4181,16 +3944,16 @@
         <w:pStyle w:val="Heading2"/>
       </w:pPr>
       <w:r>
-        <w:t xml:space="preserve">20.4. Le réglage des hyperparamètres</w:t>
-      </w:r>
-    </w:p>
-    <w:p>
-      <w:pPr>
-        <w:spacing w:after="120" w:line="276"/>
-        <w:jc w:val="both"/>
-      </w:pPr>
-      <w:r>
-        <w:t xml:space="preserve">Le taux d'apprentissage, le nombre de couches et de neurones, le nombre d'époques, la valeur de gamma du RBF ou le paramètre C du SVM représentent un grand nombre de paramètres à régler, sans intuition initiale. Nous avons procédé par essais successifs. Nous avons par exemple constaté qu'un taux d'apprentissage de 0.001 est trop faible pour les quatre exemples du XOR, et qu'une valeur de 0.5 à 1.0 est nécessaire. Ce constat explique également l'intérêt d'Adam, dont l'auto-régulation a sensiblement facilité ce réglage.</w:t>
+        <w:t xml:space="preserve">19.4. Le réglage des hyperparamètres</w:t>
+      </w:r>
+    </w:p>
+    <w:p>
+      <w:pPr>
+        <w:spacing w:after="120" w:line="276"/>
+        <w:jc w:val="both"/>
+      </w:pPr>
+      <w:r>
+        <w:t xml:space="preserve">Le taux d'apprentissage, le nombre de couches et de neurones, le nombre d'époques, la valeur de gamma du RBF ou le paramètre C du SVM représentent un grand nombre de paramètres à régler, sans intuition initiale. Nous avons procédé par essais successifs. Nous avons par exemple constaté qu'un taux d'apprentissage de 0.001 est trop faible pour les quatre exemples du XOR, et qu'une valeur de 0.5 à 1.0 est nécessaire pour obtenir une convergence rapide.</w:t>
       </w:r>
     </w:p>
     <w:p>
@@ -4198,25 +3961,25 @@
         <w:pStyle w:val="Heading1"/>
       </w:pPr>
       <w:r>
-        <w:t xml:space="preserve">21. Conclusion</w:t>
-      </w:r>
-    </w:p>
-    <w:p>
-      <w:pPr>
-        <w:spacing w:after="120" w:line="276"/>
-        <w:jc w:val="both"/>
-      </w:pPr>
-      <w:r>
-        <w:t xml:space="preserve">VisionAI constitue aujourd'hui un framework de Machine Learning fonctionnel et cohérent de bout en bout : un cœur en Rust regroupant quatre familles de modèles, trois optimiseurs et une suite de métriques, validé par 123 tests, exposé en Python et via une API REST, et exploitable depuis une application cliente web sur de nouvelles données. La chaîne complète — entraînement, sauvegarde, rechargement, prédiction — fonctionne aussi bien sur les cas de test que sur le jeu de données d'images constitué pour le projet.</w:t>
-      </w:r>
-    </w:p>
-    <w:p>
-      <w:pPr>
-        <w:spacing w:after="120" w:line="276"/>
-        <w:jc w:val="both"/>
-      </w:pPr>
-      <w:r>
-        <w:t xml:space="preserve">Au-delà du livrable, ce projet nous a permis de comprendre le fonctionnement réel d'un réseau de neurones, d'une descente de gradient, d'un noyau ou d'un optimiseur adaptatif, autant de notions qui seraient demeurées abstraites avec le seul recours à scikit-learn ou PyTorch. Il nous a également conduits à apprendre Rust, objectif initialement secondaire mais qui a représenté une part importante du travail et de l'apprentissage.</w:t>
+        <w:t xml:space="preserve">20. Conclusion</w:t>
+      </w:r>
+    </w:p>
+    <w:p>
+      <w:pPr>
+        <w:spacing w:after="120" w:line="276"/>
+        <w:jc w:val="both"/>
+      </w:pPr>
+      <w:r>
+        <w:t xml:space="preserve">VisionAI constitue aujourd'hui un framework de Machine Learning fonctionnel et cohérent de bout en bout : un cœur en Rust regroupant les quatre modèles imposés et la sauvegarde JSON, validé par plus de 90 tests, exposé en Python et via une API REST, et exploitable depuis une application cliente web sur de nouvelles données. La chaîne complète — entraînement, sauvegarde, rechargement, prédiction — fonctionne aussi bien sur les cas de test que sur le jeu de données d'images constitué pour le projet.</w:t>
+      </w:r>
+    </w:p>
+    <w:p>
+      <w:pPr>
+        <w:spacing w:after="120" w:line="276"/>
+        <w:jc w:val="both"/>
+      </w:pPr>
+      <w:r>
+        <w:t xml:space="preserve">Au-delà du livrable, ce projet nous a permis de comprendre le fonctionnement réel d'un réseau de neurones, d'une descente de gradient ou d'un noyau, autant de notions qui seraient demeurées abstraites avec le seul recours à scikit-learn ou PyTorch. Il nous a également conduits à apprendre Rust, objectif initialement secondaire mais qui a représenté une part importante du travail et de l'apprentissage.</w:t>
       </w:r>
     </w:p>
     <w:p>
@@ -4390,7 +4153,7 @@
                 <w:sz w:val="20"/>
                 <w:szCs w:val="20"/>
               </w:rPr>
-              <w:t xml:space="preserve">Cœur ML : Matrix, fonctions d'activation, MLP (propagation avant, rétropropagation), optimiseurs (momentum, Adam), métriques, sérialisation serde, tests unitaires et d'intégration, application cliente web, rapport</w:t>
+              <w:t xml:space="preserve">Cœur ML : Matrix, fonctions d'activation, MLP (propagation avant, rétropropagation), réseau RBF, sérialisation serde (JSON), tests unitaires et d'intégration, application cliente web, rapport</w:t>
             </w:r>
           </w:p>
         </w:tc>
@@ -4634,7 +4397,7 @@
           <w:sz w:val="19"/>
           <w:szCs w:val="19"/>
         </w:rPr>
-        <w:t xml:space="preserve">|       |-- optim/            gradient_descent.rs, sgd_momentum.rs, adam.rs, optimizer.rs</w:t>
+        <w:t xml:space="preserve">|       `-- optim/            gradient_descent.rs</w:t>
       </w:r>
     </w:p>
     <w:p>
@@ -4648,21 +4411,7 @@
           <w:sz w:val="19"/>
           <w:szCs w:val="19"/>
         </w:rPr>
-        <w:t xml:space="preserve">|       `-- metrics/          mod.rs (accuracy, confusion, F1, MSE/MAE/R2, k-fold)</w:t>
-      </w:r>
-    </w:p>
-    <w:p>
-      <w:pPr>
-        <w:shd w:fill="F2F2F2" w:val="clear"/>
-        <w:spacing w:after="40" w:before="40"/>
-      </w:pPr>
-      <w:r>
-        <w:rPr>
-          <w:rFonts w:ascii="Consolas" w:cs="Consolas" w:eastAsia="Consolas" w:hAnsi="Consolas"/>
-          <w:sz w:val="19"/>
-          <w:szCs w:val="19"/>
-        </w:rPr>
-        <w:t xml:space="preserve">|   `-- tests/                integration_tests.rs (69 tests)</w:t>
+        <w:t xml:space="preserve">|   `-- tests/                integration_tests.rs (53 tests)</w:t>
       </w:r>
     </w:p>
     <w:p>
@@ -5119,7 +4868,7 @@
                 <w:sz w:val="20"/>
                 <w:szCs w:val="20"/>
               </w:rPr>
-              <w:t xml:space="preserve">Gradient</w:t>
+              <w:t xml:space="preserve">Descente de gradient</w:t>
             </w:r>
           </w:p>
         </w:tc>
@@ -5149,7 +4898,7 @@
                 <w:sz w:val="20"/>
                 <w:szCs w:val="20"/>
               </w:rPr>
-              <w:t xml:space="preserve">Direction de modification des poids permettant de réduire l'erreur</w:t>
+              <w:t xml:space="preserve">Méthode d'optimisation ajustant les poids dans la direction qui réduit l'erreur</w:t>
             </w:r>
           </w:p>
         </w:tc>
@@ -5444,7 +5193,7 @@
                 <w:sz w:val="20"/>
                 <w:szCs w:val="20"/>
               </w:rPr>
-              <w:t xml:space="preserve">Momentum / Adam</w:t>
+              <w:t xml:space="preserve">MSE</w:t>
             </w:r>
           </w:p>
         </w:tc>
@@ -5474,72 +5223,7 @@
                 <w:sz w:val="20"/>
                 <w:szCs w:val="20"/>
               </w:rPr>
-              <w:t xml:space="preserve">Optimiseurs accélérant et stabilisant la descente de gradient</w:t>
-            </w:r>
-          </w:p>
-        </w:tc>
-      </w:tr>
-      <w:tr>
-        <w:trPr>
-          <w:tblHeader w:val="false"/>
-        </w:trPr>
-        <w:tc>
-          <w:tcPr>
-            <w:tcW w:type="dxa" w:w="2600"/>
-            <w:tcBorders>
-              <w:top w:val="single" w:color="BBBBBB" w:sz="1"/>
-              <w:left w:val="single" w:color="BBBBBB" w:sz="1"/>
-              <w:bottom w:val="single" w:color="BBBBBB" w:sz="1"/>
-              <w:right w:val="single" w:color="BBBBBB" w:sz="1"/>
-            </w:tcBorders>
-            <w:shd w:fill="FFFFFF" w:val="clear"/>
-            <w:tcMar>
-              <w:top w:type="dxa" w:w="60"/>
-              <w:left w:type="dxa" w:w="110"/>
-              <w:bottom w:type="dxa" w:w="60"/>
-              <w:right w:type="dxa" w:w="110"/>
-            </w:tcMar>
-          </w:tcPr>
-          <w:p>
-            <w:r>
-              <w:rPr>
-                <w:b w:val="false"/>
-                <w:bCs w:val="false"/>
-                <w:color w:val="000000"/>
-                <w:sz w:val="20"/>
-                <w:szCs w:val="20"/>
-              </w:rPr>
-              <w:t xml:space="preserve">MSE / MAE / R²</w:t>
-            </w:r>
-          </w:p>
-        </w:tc>
-        <w:tc>
-          <w:tcPr>
-            <w:tcW w:type="dxa" w:w="6760"/>
-            <w:tcBorders>
-              <w:top w:val="single" w:color="BBBBBB" w:sz="1"/>
-              <w:left w:val="single" w:color="BBBBBB" w:sz="1"/>
-              <w:bottom w:val="single" w:color="BBBBBB" w:sz="1"/>
-              <w:right w:val="single" w:color="BBBBBB" w:sz="1"/>
-            </w:tcBorders>
-            <w:shd w:fill="FFFFFF" w:val="clear"/>
-            <w:tcMar>
-              <w:top w:type="dxa" w:w="60"/>
-              <w:left w:type="dxa" w:w="110"/>
-              <w:bottom w:type="dxa" w:w="60"/>
-              <w:right w:type="dxa" w:w="110"/>
-            </w:tcMar>
-          </w:tcPr>
-          <w:p>
-            <w:r>
-              <w:rPr>
-                <w:b w:val="false"/>
-                <w:bCs w:val="false"/>
-                <w:color w:val="000000"/>
-                <w:sz w:val="20"/>
-                <w:szCs w:val="20"/>
-              </w:rPr>
-              <w:t xml:space="preserve">Métriques d'erreur et de qualité pour la régression</w:t>
+              <w:t xml:space="preserve">Mean Squared Error, erreur moyenne au carré utilisée comme fonction de coût</w:t>
             </w:r>
           </w:p>
         </w:tc>
@@ -6115,18 +5799,6 @@
       <w:start w:val="1"/>
       <w:numFmt w:val="bullet"/>
       <w:lvlText w:val="•"/>
-      <w:lvlJc w:val="left"/>
-      <w:pPr>
-        <w:ind w:left="560" w:hanging="280"/>
-      </w:pPr>
-    </w:lvl>
-  </w:abstractNum>
-  <w:abstractNum w:abstractNumId="3" w15:restartNumberingAfterBreak="0">
-    <w:multiLevelType w:val="hybridMultilevel"/>
-    <w:lvl w:ilvl="0" w15:tentative="1">
-      <w:start w:val="1"/>
-      <w:numFmt w:val="decimal"/>
-      <w:lvlText w:val="%1."/>
       <w:lvlJc w:val="left"/>
       <w:pPr>
         <w:ind w:left="560" w:hanging="280"/>

</xml_diff>